<commit_message>
Reorganize repo: remove old root-level files, update strategy report
Co-Authored-By: Claude Sonnet 4.6 <noreply@anthropic.com>
</commit_message>
<xml_diff>
--- a/Capstone_Strategy_Report.docx
+++ b/Capstone_Strategy_Report.docx
@@ -61,19 +61,6 @@
           <w:szCs w:val="22"/>
         </w:rPr>
         <w:t>Framework: QuantResearch.py</w:t>
-      </w:r>
-    </w:p>
-    <w:p>
-      <w:pPr>
-        <w:spacing w:before="1600"/>
-        <w:jc w:val="center"/>
-      </w:pPr>
-      <w:r>
-        <w:rPr>
-          <w:sz w:val="22"/>
-          <w:szCs w:val="22"/>
-        </w:rPr>
-        <w:t>Capstone Project — Group 7132</w:t>
       </w:r>
     </w:p>
     <w:p>
@@ -2309,12 +2296,6 @@
         <w:gridCol w:w="6760"/>
       </w:tblGrid>
       <w:tr>
-        <w:tblPrEx>
-          <w:tblCellMar>
-            <w:top w:w="0" w:type="dxa"/>
-            <w:bottom w:w="0" w:type="dxa"/>
-          </w:tblCellMar>
-        </w:tblPrEx>
         <w:trPr>
           <w:tblHeader/>
         </w:trPr>
@@ -2383,12 +2364,6 @@
         </w:tc>
       </w:tr>
       <w:tr>
-        <w:tblPrEx>
-          <w:tblCellMar>
-            <w:top w:w="0" w:type="dxa"/>
-            <w:bottom w:w="0" w:type="dxa"/>
-          </w:tblCellMar>
-        </w:tblPrEx>
         <w:tc>
           <w:tcPr>
             <w:tcW w:w="2600" w:type="dxa"/>
@@ -2450,12 +2425,6 @@
         </w:tc>
       </w:tr>
       <w:tr>
-        <w:tblPrEx>
-          <w:tblCellMar>
-            <w:top w:w="0" w:type="dxa"/>
-            <w:bottom w:w="0" w:type="dxa"/>
-          </w:tblCellMar>
-        </w:tblPrEx>
         <w:tc>
           <w:tcPr>
             <w:tcW w:w="2600" w:type="dxa"/>
@@ -2519,12 +2488,6 @@
         </w:tc>
       </w:tr>
       <w:tr>
-        <w:tblPrEx>
-          <w:tblCellMar>
-            <w:top w:w="0" w:type="dxa"/>
-            <w:bottom w:w="0" w:type="dxa"/>
-          </w:tblCellMar>
-        </w:tblPrEx>
         <w:tc>
           <w:tcPr>
             <w:tcW w:w="2600" w:type="dxa"/>
@@ -2584,12 +2547,6 @@
         </w:tc>
       </w:tr>
       <w:tr>
-        <w:tblPrEx>
-          <w:tblCellMar>
-            <w:top w:w="0" w:type="dxa"/>
-            <w:bottom w:w="0" w:type="dxa"/>
-          </w:tblCellMar>
-        </w:tblPrEx>
         <w:tc>
           <w:tcPr>
             <w:tcW w:w="2600" w:type="dxa"/>
@@ -2653,12 +2610,6 @@
         </w:tc>
       </w:tr>
       <w:tr>
-        <w:tblPrEx>
-          <w:tblCellMar>
-            <w:top w:w="0" w:type="dxa"/>
-            <w:bottom w:w="0" w:type="dxa"/>
-          </w:tblCellMar>
-        </w:tblPrEx>
         <w:tc>
           <w:tcPr>
             <w:tcW w:w="2600" w:type="dxa"/>
@@ -2720,12 +2671,6 @@
         </w:tc>
       </w:tr>
       <w:tr>
-        <w:tblPrEx>
-          <w:tblCellMar>
-            <w:top w:w="0" w:type="dxa"/>
-            <w:bottom w:w="0" w:type="dxa"/>
-          </w:tblCellMar>
-        </w:tblPrEx>
         <w:tc>
           <w:tcPr>
             <w:tcW w:w="2600" w:type="dxa"/>
@@ -2789,12 +2734,6 @@
         </w:tc>
       </w:tr>
       <w:tr>
-        <w:tblPrEx>
-          <w:tblCellMar>
-            <w:top w:w="0" w:type="dxa"/>
-            <w:bottom w:w="0" w:type="dxa"/>
-          </w:tblCellMar>
-        </w:tblPrEx>
         <w:tc>
           <w:tcPr>
             <w:tcW w:w="2600" w:type="dxa"/>
@@ -2856,12 +2795,6 @@
         </w:tc>
       </w:tr>
       <w:tr>
-        <w:tblPrEx>
-          <w:tblCellMar>
-            <w:top w:w="0" w:type="dxa"/>
-            <w:bottom w:w="0" w:type="dxa"/>
-          </w:tblCellMar>
-        </w:tblPrEx>
         <w:tc>
           <w:tcPr>
             <w:tcW w:w="2600" w:type="dxa"/>
@@ -2943,12 +2876,6 @@
         </w:tc>
       </w:tr>
       <w:tr>
-        <w:tblPrEx>
-          <w:tblCellMar>
-            <w:top w:w="0" w:type="dxa"/>
-            <w:bottom w:w="0" w:type="dxa"/>
-          </w:tblCellMar>
-        </w:tblPrEx>
         <w:tc>
           <w:tcPr>
             <w:tcW w:w="2600" w:type="dxa"/>
@@ -3667,12 +3594,6 @@
         <w:gridCol w:w="1272"/>
       </w:tblGrid>
       <w:tr>
-        <w:tblPrEx>
-          <w:tblCellMar>
-            <w:top w:w="0" w:type="dxa"/>
-            <w:bottom w:w="0" w:type="dxa"/>
-          </w:tblCellMar>
-        </w:tblPrEx>
         <w:trPr>
           <w:tblHeader/>
         </w:trPr>
@@ -3875,12 +3796,6 @@
         </w:tc>
       </w:tr>
       <w:tr>
-        <w:tblPrEx>
-          <w:tblCellMar>
-            <w:top w:w="0" w:type="dxa"/>
-            <w:bottom w:w="0" w:type="dxa"/>
-          </w:tblCellMar>
-        </w:tblPrEx>
         <w:tc>
           <w:tcPr>
             <w:tcW w:w="3000" w:type="dxa"/>
@@ -4062,12 +3977,6 @@
         </w:tc>
       </w:tr>
       <w:tr>
-        <w:tblPrEx>
-          <w:tblCellMar>
-            <w:top w:w="0" w:type="dxa"/>
-            <w:bottom w:w="0" w:type="dxa"/>
-          </w:tblCellMar>
-        </w:tblPrEx>
         <w:tc>
           <w:tcPr>
             <w:tcW w:w="3000" w:type="dxa"/>
@@ -4255,12 +4164,6 @@
         </w:tc>
       </w:tr>
       <w:tr>
-        <w:tblPrEx>
-          <w:tblCellMar>
-            <w:top w:w="0" w:type="dxa"/>
-            <w:bottom w:w="0" w:type="dxa"/>
-          </w:tblCellMar>
-        </w:tblPrEx>
         <w:tc>
           <w:tcPr>
             <w:tcW w:w="3000" w:type="dxa"/>
@@ -4442,12 +4345,6 @@
         </w:tc>
       </w:tr>
       <w:tr>
-        <w:tblPrEx>
-          <w:tblCellMar>
-            <w:top w:w="0" w:type="dxa"/>
-            <w:bottom w:w="0" w:type="dxa"/>
-          </w:tblCellMar>
-        </w:tblPrEx>
         <w:tc>
           <w:tcPr>
             <w:tcW w:w="3000" w:type="dxa"/>
@@ -4635,12 +4532,6 @@
         </w:tc>
       </w:tr>
       <w:tr>
-        <w:tblPrEx>
-          <w:tblCellMar>
-            <w:top w:w="0" w:type="dxa"/>
-            <w:bottom w:w="0" w:type="dxa"/>
-          </w:tblCellMar>
-        </w:tblPrEx>
         <w:tc>
           <w:tcPr>
             <w:tcW w:w="3000" w:type="dxa"/>
@@ -4822,12 +4713,6 @@
         </w:tc>
       </w:tr>
       <w:tr>
-        <w:tblPrEx>
-          <w:tblCellMar>
-            <w:top w:w="0" w:type="dxa"/>
-            <w:bottom w:w="0" w:type="dxa"/>
-          </w:tblCellMar>
-        </w:tblPrEx>
         <w:tc>
           <w:tcPr>
             <w:tcW w:w="3000" w:type="dxa"/>
@@ -5015,12 +4900,6 @@
         </w:tc>
       </w:tr>
       <w:tr>
-        <w:tblPrEx>
-          <w:tblCellMar>
-            <w:top w:w="0" w:type="dxa"/>
-            <w:bottom w:w="0" w:type="dxa"/>
-          </w:tblCellMar>
-        </w:tblPrEx>
         <w:tc>
           <w:tcPr>
             <w:tcW w:w="3000" w:type="dxa"/>
@@ -5202,12 +5081,6 @@
         </w:tc>
       </w:tr>
       <w:tr>
-        <w:tblPrEx>
-          <w:tblCellMar>
-            <w:top w:w="0" w:type="dxa"/>
-            <w:bottom w:w="0" w:type="dxa"/>
-          </w:tblCellMar>
-        </w:tblPrEx>
         <w:tc>
           <w:tcPr>
             <w:tcW w:w="3000" w:type="dxa"/>
@@ -5395,12 +5268,6 @@
         </w:tc>
       </w:tr>
       <w:tr>
-        <w:tblPrEx>
-          <w:tblCellMar>
-            <w:top w:w="0" w:type="dxa"/>
-            <w:bottom w:w="0" w:type="dxa"/>
-          </w:tblCellMar>
-        </w:tblPrEx>
         <w:tc>
           <w:tcPr>
             <w:tcW w:w="3000" w:type="dxa"/>
@@ -5713,12 +5580,6 @@
         <w:gridCol w:w="1667"/>
       </w:tblGrid>
       <w:tr>
-        <w:tblPrEx>
-          <w:tblCellMar>
-            <w:top w:w="0" w:type="dxa"/>
-            <w:bottom w:w="0" w:type="dxa"/>
-          </w:tblCellMar>
-        </w:tblPrEx>
         <w:trPr>
           <w:tblHeader/>
         </w:trPr>
@@ -5875,12 +5736,6 @@
         </w:tc>
       </w:tr>
       <w:tr>
-        <w:tblPrEx>
-          <w:tblCellMar>
-            <w:top w:w="0" w:type="dxa"/>
-            <w:bottom w:w="0" w:type="dxa"/>
-          </w:tblCellMar>
-        </w:tblPrEx>
         <w:tc>
           <w:tcPr>
             <w:tcW w:w="4360" w:type="dxa"/>
@@ -6000,12 +5855,6 @@
         </w:tc>
       </w:tr>
       <w:tr>
-        <w:tblPrEx>
-          <w:tblCellMar>
-            <w:top w:w="0" w:type="dxa"/>
-            <w:bottom w:w="0" w:type="dxa"/>
-          </w:tblCellMar>
-        </w:tblPrEx>
         <w:tc>
           <w:tcPr>
             <w:tcW w:w="4360" w:type="dxa"/>
@@ -6130,12 +5979,6 @@
         </w:tc>
       </w:tr>
       <w:tr>
-        <w:tblPrEx>
-          <w:tblCellMar>
-            <w:top w:w="0" w:type="dxa"/>
-            <w:bottom w:w="0" w:type="dxa"/>
-          </w:tblCellMar>
-        </w:tblPrEx>
         <w:tc>
           <w:tcPr>
             <w:tcW w:w="4360" w:type="dxa"/>
@@ -6489,12 +6332,6 @@
         <w:gridCol w:w="2340"/>
       </w:tblGrid>
       <w:tr>
-        <w:tblPrEx>
-          <w:tblCellMar>
-            <w:top w:w="0" w:type="dxa"/>
-            <w:bottom w:w="0" w:type="dxa"/>
-          </w:tblCellMar>
-        </w:tblPrEx>
         <w:trPr>
           <w:tblHeader/>
         </w:trPr>
@@ -6629,12 +6466,6 @@
         </w:tc>
       </w:tr>
       <w:tr>
-        <w:tblPrEx>
-          <w:tblCellMar>
-            <w:top w:w="0" w:type="dxa"/>
-            <w:bottom w:w="0" w:type="dxa"/>
-          </w:tblCellMar>
-        </w:tblPrEx>
         <w:tc>
           <w:tcPr>
             <w:tcW w:w="2340" w:type="dxa"/>
@@ -6754,12 +6585,6 @@
         </w:tc>
       </w:tr>
       <w:tr>
-        <w:tblPrEx>
-          <w:tblCellMar>
-            <w:top w:w="0" w:type="dxa"/>
-            <w:bottom w:w="0" w:type="dxa"/>
-          </w:tblCellMar>
-        </w:tblPrEx>
         <w:tc>
           <w:tcPr>
             <w:tcW w:w="2340" w:type="dxa"/>
@@ -6997,12 +6822,6 @@
         <w:gridCol w:w="2120"/>
       </w:tblGrid>
       <w:tr>
-        <w:tblPrEx>
-          <w:tblCellMar>
-            <w:top w:w="0" w:type="dxa"/>
-            <w:bottom w:w="0" w:type="dxa"/>
-          </w:tblCellMar>
-        </w:tblPrEx>
         <w:trPr>
           <w:tblHeader/>
         </w:trPr>
@@ -7137,12 +6956,6 @@
         </w:tc>
       </w:tr>
       <w:tr>
-        <w:tblPrEx>
-          <w:tblCellMar>
-            <w:top w:w="0" w:type="dxa"/>
-            <w:bottom w:w="0" w:type="dxa"/>
-          </w:tblCellMar>
-        </w:tblPrEx>
         <w:tc>
           <w:tcPr>
             <w:tcW w:w="3000" w:type="dxa"/>
@@ -7264,12 +7077,6 @@
         </w:tc>
       </w:tr>
       <w:tr>
-        <w:tblPrEx>
-          <w:tblCellMar>
-            <w:top w:w="0" w:type="dxa"/>
-            <w:bottom w:w="0" w:type="dxa"/>
-          </w:tblCellMar>
-        </w:tblPrEx>
         <w:tc>
           <w:tcPr>
             <w:tcW w:w="3000" w:type="dxa"/>
@@ -7395,12 +7202,6 @@
         </w:tc>
       </w:tr>
       <w:tr>
-        <w:tblPrEx>
-          <w:tblCellMar>
-            <w:top w:w="0" w:type="dxa"/>
-            <w:bottom w:w="0" w:type="dxa"/>
-          </w:tblCellMar>
-        </w:tblPrEx>
         <w:tc>
           <w:tcPr>
             <w:tcW w:w="3000" w:type="dxa"/>

</xml_diff>